<commit_message>
Update documentation screenshots and DOCX for ECS on EC2 delivery.
Refresh evidence images, scrub account UI from AWS captures, and regenerate project documentation authored as John.
</commit_message>
<xml_diff>
--- a/docs/PROJECT_DOCUMENTATION.docx
+++ b/docs/PROJECT_DOCUMENTATION.docx
@@ -4,10 +4,15 @@
   <w:body>
     <w:p>
       <w:pPr>
-        <w:pStyle w:val="Title"/>
         <w:jc w:val="center"/>
       </w:pPr>
       <w:r>
+        <w:rPr>
+          <w:rFonts w:ascii="Calibri" w:hAnsi="Calibri"/>
+          <w:b/>
+          <w:color w:val="1F2937"/>
+          <w:sz w:val="44"/>
+        </w:rPr>
         <w:t>DevOps Final Project Documentation</w:t>
       </w:r>
     </w:p>
@@ -17,89 +22,40 @@
       </w:pPr>
       <w:r>
         <w:rPr>
+          <w:rFonts w:ascii="Calibri" w:hAnsi="Calibri"/>
+          <w:b/>
+          <w:color w:val="1F2937"/>
           <w:sz w:val="28"/>
         </w:rPr>
-        <w:t>Docker + GitHub Actions + Docker Hub + Amazon ECS on EC2</w:t>
-      </w:r>
-    </w:p>
-    <w:p/>
-    <w:p>
-      <w:r>
-        <w:rPr>
-          <w:b w:val="0"/>
-        </w:rPr>
-        <w:t>Course: DevOps Final Project</w:t>
+        <w:t>final-python — Docker Hub CI/CD + Amazon ECS on EC2</w:t>
       </w:r>
     </w:p>
     <w:p>
+      <w:pPr>
+        <w:jc w:val="center"/>
+      </w:pPr>
       <w:r>
         <w:rPr>
+          <w:rFonts w:ascii="Calibri" w:hAnsi="Calibri"/>
           <w:b w:val="0"/>
+          <w:color w:val="1F2937"/>
+          <w:sz w:val="22"/>
         </w:rPr>
-        <w:t>Application: final-python (Flask REST API)</w:t>
+        <w:t>Prepared by: John</w:t>
       </w:r>
     </w:p>
     <w:p>
+      <w:pPr>
+        <w:spacing w:after="160"/>
+      </w:pPr>
       <w:r>
         <w:rPr>
+          <w:rFonts w:ascii="Calibri" w:hAnsi="Calibri"/>
           <w:b w:val="0"/>
+          <w:color w:val="1F2937"/>
+          <w:sz w:val="22"/>
         </w:rPr>
-        <w:t>GitHub: https://github.com/john-2331/final-python</w:t>
-      </w:r>
-    </w:p>
-    <w:p>
-      <w:r>
-        <w:rPr>
-          <w:b w:val="0"/>
-        </w:rPr>
-        <w:t>Docker Hub: https://hub.docker.com/r/john2331/final-python</w:t>
-      </w:r>
-    </w:p>
-    <w:p>
-      <w:r>
-        <w:rPr>
-          <w:b w:val="0"/>
-        </w:rPr>
-        <w:t>AWS Region: us-east-1</w:t>
-      </w:r>
-    </w:p>
-    <w:p>
-      <w:r>
-        <w:rPr>
-          <w:b w:val="0"/>
-        </w:rPr>
-        <w:t>AWS Account: 139830186794</w:t>
-      </w:r>
-    </w:p>
-    <w:p/>
-    <w:p>
-      <w:r>
-        <w:rPr>
-          <w:b w:val="0"/>
-        </w:rPr>
-        <w:t>Partner 1 – Full name: ___________________________  ID: ______________</w:t>
-      </w:r>
-    </w:p>
-    <w:p>
-      <w:r>
-        <w:rPr>
-          <w:b w:val="0"/>
-        </w:rPr>
-        <w:t>Partner 2 – Full name: ___________________________  ID: ______________</w:t>
-      </w:r>
-    </w:p>
-    <w:p/>
-    <w:p>
-      <w:r>
-        <w:rPr>
-          <w:b w:val="0"/>
-        </w:rPr>
-        <w:t>Note: This document includes written explanations and screenshots for each course part.</w:t>
-      </w:r>
-    </w:p>
-    <w:p>
-      <w:r>
-        <w:br w:type="page"/>
+        <w:t>This document describes the completed DevOps final project: containerize the final-python Flask application, push images to Docker Hub with GitHub Actions, and deploy to Amazon ECS using the EC2 launch type (one EC2 container instance) behind an Application Load Balancer.</w:t>
       </w:r>
     </w:p>
     <w:p>
@@ -107,23 +63,10 @@
         <w:pStyle w:val="Heading1"/>
       </w:pPr>
       <w:r>
-        <w:t>1. Project Overview</w:t>
-      </w:r>
-    </w:p>
-    <w:p>
-      <w:r>
         <w:rPr>
-          <w:b w:val="0"/>
+          <w:color w:val="111827"/>
         </w:rPr>
-        <w:t>This project delivers a complete DevOps pipeline for the final-python Flask application. The application is dockerized, published to Docker Hub using GitHub Actions, and deployed to Amazon ECS using the EC2 launch type with one EC2 container instance. An Application Load Balancer exposes the application publicly.</w:t>
-      </w:r>
-    </w:p>
-    <w:p>
-      <w:pPr>
-        <w:pStyle w:val="Heading2"/>
-      </w:pPr>
-      <w:r>
-        <w:t>1.1 Selected course options</w:t>
+        <w:t>1. Project overview</w:t>
       </w:r>
     </w:p>
     <w:p>
@@ -131,7 +74,13 @@
         <w:pStyle w:val="ListBullet"/>
       </w:pPr>
       <w:r>
-        <w:t>Part A: Dockerfile for https://github.com/lidorg-dev/final-python (Compose also provided for local use)</w:t>
+        <w:rPr>
+          <w:rFonts w:ascii="Calibri" w:hAnsi="Calibri"/>
+          <w:b w:val="0"/>
+          <w:color w:val="1F2937"/>
+          <w:sz w:val="22"/>
+        </w:rPr>
+        <w:t>GitHub repository: https://github.com/john-2331/final-python</w:t>
       </w:r>
     </w:p>
     <w:p>
@@ -139,7 +88,13 @@
         <w:pStyle w:val="ListBullet"/>
       </w:pPr>
       <w:r>
-        <w:t>Part B: GitHub Actions workflow — checkout → build → push to Docker Hub (same code as Part A)</w:t>
+        <w:rPr>
+          <w:rFonts w:ascii="Calibri" w:hAnsi="Calibri"/>
+          <w:b w:val="0"/>
+          <w:color w:val="1F2937"/>
+          <w:sz w:val="22"/>
+        </w:rPr>
+        <w:t>Docker Hub image: john2331/final-python</w:t>
       </w:r>
     </w:p>
     <w:p>
@@ -147,23 +102,13 @@
         <w:pStyle w:val="ListBullet"/>
       </w:pPr>
       <w:r>
-        <w:t>Part C: Amazon ECS with one EC2 instance — deploy the Docker Hub image to ECS on EC2</w:t>
-      </w:r>
-    </w:p>
-    <w:p>
-      <w:pPr>
-        <w:pStyle w:val="Heading2"/>
-      </w:pPr>
-      <w:r>
-        <w:t>1.2 Architecture</w:t>
-      </w:r>
-    </w:p>
-    <w:p>
-      <w:r>
         <w:rPr>
+          <w:rFonts w:ascii="Calibri" w:hAnsi="Calibri"/>
           <w:b w:val="0"/>
+          <w:color w:val="1F2937"/>
+          <w:sz w:val="22"/>
         </w:rPr>
-        <w:t>Developer pushes to main → GitHub Actions builds the image → image is pushed to Docker Hub → ECS service on EC2 is updated → users access the app through the Application Load Balancer. Logs are written to Amazon CloudWatch.</w:t>
+        <w:t>AWS region: us-east-1</w:t>
       </w:r>
     </w:p>
     <w:p>
@@ -171,7 +116,13 @@
         <w:pStyle w:val="ListBullet"/>
       </w:pPr>
       <w:r>
-        <w:t>Registry: Docker Hub only (Amazon ECR is not used)</w:t>
+        <w:rPr>
+          <w:rFonts w:ascii="Calibri" w:hAnsi="Calibri"/>
+          <w:b w:val="0"/>
+          <w:color w:val="1F2937"/>
+          <w:sz w:val="22"/>
+        </w:rPr>
+        <w:t>Launch type: Amazon ECS on EC2</w:t>
       </w:r>
     </w:p>
     <w:p>
@@ -179,7 +130,13 @@
         <w:pStyle w:val="ListBullet"/>
       </w:pPr>
       <w:r>
-        <w:t>Compute: Amazon ECS, launch type EC2, one registered EC2 instance</w:t>
+        <w:rPr>
+          <w:rFonts w:ascii="Calibri" w:hAnsi="Calibri"/>
+          <w:b w:val="0"/>
+          <w:color w:val="1F2937"/>
+          <w:sz w:val="22"/>
+        </w:rPr>
+        <w:t>Cluster: final-python-cluster</w:t>
       </w:r>
     </w:p>
     <w:p>
@@ -187,7 +144,13 @@
         <w:pStyle w:val="ListBullet"/>
       </w:pPr>
       <w:r>
-        <w:t>Ingress: Application Load Balancer on port 80 → container port 5000</w:t>
+        <w:rPr>
+          <w:rFonts w:ascii="Calibri" w:hAnsi="Calibri"/>
+          <w:b w:val="0"/>
+          <w:color w:val="1F2937"/>
+          <w:sz w:val="22"/>
+        </w:rPr>
+        <w:t>Service: final-python-service</w:t>
       </w:r>
     </w:p>
     <w:p>
@@ -195,7 +158,13 @@
         <w:pStyle w:val="ListBullet"/>
       </w:pPr>
       <w:r>
-        <w:t>Live URL: http://final-python-alb-1567240385.us-east-1.elb.amazonaws.com/api/doc</w:t>
+        <w:rPr>
+          <w:rFonts w:ascii="Calibri" w:hAnsi="Calibri"/>
+          <w:b w:val="0"/>
+          <w:color w:val="1F2937"/>
+          <w:sz w:val="22"/>
+        </w:rPr>
+        <w:t>Task definition family: final-python (requiresCompatibilities: EC2)</w:t>
       </w:r>
     </w:p>
     <w:p>
@@ -203,12 +172,41 @@
         <w:pStyle w:val="ListBullet"/>
       </w:pPr>
       <w:r>
-        <w:t>Health URL: http://final-python-alb-1567240385.us-east-1.elb.amazonaws.com/health</w:t>
+        <w:rPr>
+          <w:rFonts w:ascii="Calibri" w:hAnsi="Calibri"/>
+          <w:b w:val="0"/>
+          <w:color w:val="1F2937"/>
+          <w:sz w:val="22"/>
+        </w:rPr>
+        <w:t>Container port: 5000</w:t>
       </w:r>
     </w:p>
     <w:p>
+      <w:pPr>
+        <w:pStyle w:val="ListBullet"/>
+      </w:pPr>
       <w:r>
-        <w:br w:type="page"/>
+        <w:rPr>
+          <w:rFonts w:ascii="Calibri" w:hAnsi="Calibri"/>
+          <w:b w:val="0"/>
+          <w:color w:val="1F2937"/>
+          <w:sz w:val="22"/>
+        </w:rPr>
+        <w:t>Live app: http://final-python-alb-1567240385.us-east-1.elb.amazonaws.com/api/doc</w:t>
+      </w:r>
+    </w:p>
+    <w:p>
+      <w:pPr>
+        <w:pStyle w:val="ListBullet"/>
+      </w:pPr>
+      <w:r>
+        <w:rPr>
+          <w:rFonts w:ascii="Calibri" w:hAnsi="Calibri"/>
+          <w:b w:val="0"/>
+          <w:color w:val="1F2937"/>
+          <w:sz w:val="22"/>
+        </w:rPr>
+        <w:t>Health check: http://final-python-alb-1567240385.us-east-1.elb.amazonaws.com/health</w:t>
       </w:r>
     </w:p>
     <w:p>
@@ -216,134 +214,56 @@
         <w:pStyle w:val="Heading1"/>
       </w:pPr>
       <w:r>
-        <w:t>2. Part A (25 points) — Dockerization</w:t>
-      </w:r>
-    </w:p>
-    <w:p>
-      <w:r>
         <w:rPr>
-          <w:b w:val="0"/>
+          <w:color w:val="111827"/>
         </w:rPr>
-        <w:t>Requirement: Write a Dockerfile for the final-python repository, ensure the container runs, and provide screenshots of the GitHub repository, Dockerfile/Compose, and the application in the browser.</w:t>
+        <w:t>2. Architecture</w:t>
       </w:r>
     </w:p>
     <w:p>
       <w:pPr>
-        <w:pStyle w:val="Heading2"/>
+        <w:spacing w:after="160"/>
       </w:pPr>
       <w:r>
-        <w:t>2.1 What we implemented</w:t>
+        <w:rPr>
+          <w:rFonts w:ascii="Calibri" w:hAnsi="Calibri"/>
+          <w:b w:val="0"/>
+          <w:color w:val="1F2937"/>
+          <w:sz w:val="22"/>
+        </w:rPr>
+        <w:t>On every push to main, GitHub Actions builds a Docker image, pushes it to Docker Hub, registers a new ECS task definition revision with the new image tag, and updates the ECS service. The service runs on an ECS-optimized EC2 instance registered to the cluster. Users reach the application through an Application Load Balancer on port 80, which forwards to the container on port 5000.</w:t>
       </w:r>
     </w:p>
     <w:p>
       <w:pPr>
-        <w:pStyle w:val="ListBullet"/>
+        <w:pStyle w:val="Heading1"/>
       </w:pPr>
       <w:r>
-        <w:t>Multi-stage Dockerfile based on python:3.7-slim</w:t>
+        <w:rPr>
+          <w:color w:val="111827"/>
+        </w:rPr>
+        <w:t>3. Part A — Dockerfile</w:t>
       </w:r>
     </w:p>
     <w:p>
       <w:pPr>
-        <w:pStyle w:val="ListBullet"/>
+        <w:spacing w:after="160"/>
       </w:pPr>
       <w:r>
-        <w:t>Non-root container user and HEALTHCHECK on /health</w:t>
-      </w:r>
-    </w:p>
-    <w:p>
-      <w:pPr>
-        <w:pStyle w:val="ListBullet"/>
-      </w:pPr>
-      <w:r>
-        <w:t>docker-compose.yml for local build and run on port 5000</w:t>
-      </w:r>
-    </w:p>
-    <w:p>
-      <w:pPr>
-        <w:pStyle w:val="ListBullet"/>
-      </w:pPr>
-      <w:r>
-        <w:t>Application source under app/ (Flask + Flask-RESTPlus)</w:t>
-      </w:r>
-    </w:p>
-    <w:p>
-      <w:pPr>
-        <w:pStyle w:val="Heading2"/>
-      </w:pPr>
-      <w:r>
-        <w:t>2.2 How to run locally</w:t>
-      </w:r>
-    </w:p>
-    <w:p>
-      <w:r>
         <w:rPr>
+          <w:rFonts w:ascii="Calibri" w:hAnsi="Calibri"/>
           <w:b w:val="0"/>
+          <w:color w:val="1F2937"/>
+          <w:sz w:val="22"/>
         </w:rPr>
-        <w:t>docker build -t final-python:local .</w:t>
-      </w:r>
-    </w:p>
-    <w:p>
-      <w:r>
-        <w:rPr>
-          <w:b w:val="0"/>
-        </w:rPr>
-        <w:t>docker run --rm -p 5000:5000 --name final-python final-python:local</w:t>
-      </w:r>
-    </w:p>
-    <w:p>
-      <w:r>
-        <w:rPr>
-          <w:b w:val="0"/>
-        </w:rPr>
-        <w:t>Or: docker compose up --build -d</w:t>
-      </w:r>
-    </w:p>
-    <w:p>
-      <w:r>
-        <w:rPr>
-          <w:b w:val="0"/>
-        </w:rPr>
-        <w:t>Open http://localhost:5000/api/doc</w:t>
-      </w:r>
-    </w:p>
-    <w:p>
-      <w:pPr>
-        <w:pStyle w:val="Heading2"/>
-      </w:pPr>
-      <w:r>
-        <w:t>2.3 Written explanation</w:t>
-      </w:r>
-    </w:p>
-    <w:p>
-      <w:r>
-        <w:rPr>
-          <w:b w:val="0"/>
-        </w:rPr>
-        <w:t>For Part A we selected the final-python option. We wrote a production-oriented Dockerfile that packages the Flask API into a lightweight image. Docker Compose is used to build and launch the container locally. The Swagger UI at /api/doc confirms the application is running correctly in the browser.</w:t>
-      </w:r>
-    </w:p>
-    <w:p>
-      <w:pPr>
-        <w:pStyle w:val="Heading2"/>
-      </w:pPr>
-      <w:r>
-        <w:t>2.4 Screenshots — Part A</w:t>
-      </w:r>
-    </w:p>
-    <w:p>
-      <w:pPr>
-        <w:pStyle w:val="Heading3"/>
-      </w:pPr>
-      <w:r>
-        <w:t>GitHub repository</w:t>
+        <w:t>Part A uses a multi-stage Dockerfile for the lidorg-dev/final-python application. The builder stage installs Python dependencies; the runtime stage copies the virtual environment and application code, exposes port 5000, and starts the Flask app with debug disabled.</w:t>
       </w:r>
     </w:p>
     <w:p>
       <w:r>
         <w:drawing>
           <wp:inline xmlns:a="http://schemas.openxmlformats.org/drawingml/2006/main" xmlns:pic="http://schemas.openxmlformats.org/drawingml/2006/picture">
-            <wp:extent cx="5486400" cy="3429000"/>
+            <wp:extent cx="5760720" cy="3600450"/>
             <wp:docPr id="1" name="Picture 1"/>
             <wp:cNvGraphicFramePr>
               <a:graphicFrameLocks noChangeAspect="1"/>
@@ -364,7 +284,7 @@
                   <pic:spPr>
                     <a:xfrm>
                       <a:off x="0" y="0"/>
-                      <a:ext cx="5486400" cy="3429000"/>
+                      <a:ext cx="5760720" cy="3600450"/>
                     </a:xfrm>
                     <a:prstGeom prst="rect"/>
                   </pic:spPr>
@@ -377,29 +297,25 @@
     </w:p>
     <w:p>
       <w:pPr>
+        <w:spacing w:after="280"/>
         <w:jc w:val="center"/>
       </w:pPr>
       <w:r>
         <w:rPr>
+          <w:rFonts w:ascii="Calibri" w:hAnsi="Calibri"/>
+          <w:b w:val="0"/>
           <w:i/>
-          <w:sz w:val="20"/>
+          <w:color w:val="1F2937"/>
+          <w:sz w:val="18"/>
         </w:rPr>
-        <w:t>Figure A1. GitHub repository (01-github-repo.png)</w:t>
-      </w:r>
-    </w:p>
-    <w:p>
-      <w:pPr>
-        <w:pStyle w:val="Heading3"/>
-      </w:pPr>
-      <w:r>
-        <w:t>Dockerfile</w:t>
+        <w:t>Figure 1. GitHub repository (john-2331/final-python)</w:t>
       </w:r>
     </w:p>
     <w:p>
       <w:r>
         <w:drawing>
           <wp:inline xmlns:a="http://schemas.openxmlformats.org/drawingml/2006/main" xmlns:pic="http://schemas.openxmlformats.org/drawingml/2006/picture">
-            <wp:extent cx="5486400" cy="3429000"/>
+            <wp:extent cx="5760720" cy="4000500"/>
             <wp:docPr id="2" name="Picture 2"/>
             <wp:cNvGraphicFramePr>
               <a:graphicFrameLocks noChangeAspect="1"/>
@@ -420,7 +336,7 @@
                   <pic:spPr>
                     <a:xfrm>
                       <a:off x="0" y="0"/>
-                      <a:ext cx="5486400" cy="3429000"/>
+                      <a:ext cx="5760720" cy="4000500"/>
                     </a:xfrm>
                     <a:prstGeom prst="rect"/>
                   </pic:spPr>
@@ -433,29 +349,25 @@
     </w:p>
     <w:p>
       <w:pPr>
+        <w:spacing w:after="280"/>
         <w:jc w:val="center"/>
       </w:pPr>
       <w:r>
         <w:rPr>
+          <w:rFonts w:ascii="Calibri" w:hAnsi="Calibri"/>
+          <w:b w:val="0"/>
           <w:i/>
-          <w:sz w:val="20"/>
+          <w:color w:val="1F2937"/>
+          <w:sz w:val="18"/>
         </w:rPr>
-        <w:t>Figure A2. Dockerfile (02-dockerfile.png)</w:t>
-      </w:r>
-    </w:p>
-    <w:p>
-      <w:pPr>
-        <w:pStyle w:val="Heading3"/>
-      </w:pPr>
-      <w:r>
-        <w:t>Application in browser (local)</w:t>
+        <w:t>Figure 2. Dockerfile in the repository</w:t>
       </w:r>
     </w:p>
     <w:p>
       <w:r>
         <w:drawing>
           <wp:inline xmlns:a="http://schemas.openxmlformats.org/drawingml/2006/main" xmlns:pic="http://schemas.openxmlformats.org/drawingml/2006/picture">
-            <wp:extent cx="5486400" cy="3429000"/>
+            <wp:extent cx="5760720" cy="3600450"/>
             <wp:docPr id="3" name="Picture 3"/>
             <wp:cNvGraphicFramePr>
               <a:graphicFrameLocks noChangeAspect="1"/>
@@ -476,7 +388,7 @@
                   <pic:spPr>
                     <a:xfrm>
                       <a:off x="0" y="0"/>
-                      <a:ext cx="5486400" cy="3429000"/>
+                      <a:ext cx="5760720" cy="3600450"/>
                     </a:xfrm>
                     <a:prstGeom prst="rect"/>
                   </pic:spPr>
@@ -489,19 +401,18 @@
     </w:p>
     <w:p>
       <w:pPr>
+        <w:spacing w:after="280"/>
         <w:jc w:val="center"/>
       </w:pPr>
       <w:r>
         <w:rPr>
+          <w:rFonts w:ascii="Calibri" w:hAnsi="Calibri"/>
+          <w:b w:val="0"/>
           <w:i/>
-          <w:sz w:val="20"/>
+          <w:color w:val="1F2937"/>
+          <w:sz w:val="18"/>
         </w:rPr>
-        <w:t>Figure A3. Local application (03-local-app.png)</w:t>
-      </w:r>
-    </w:p>
-    <w:p>
-      <w:r>
-        <w:br w:type="page"/>
+        <w:t>Figure 3. Application running locally</w:t>
       </w:r>
     </w:p>
     <w:p>
@@ -509,94 +420,31 @@
         <w:pStyle w:val="Heading1"/>
       </w:pPr>
       <w:r>
-        <w:t>3. Part B (50 points) — GitHub Actions to Docker Hub</w:t>
-      </w:r>
-    </w:p>
-    <w:p>
-      <w:r>
         <w:rPr>
-          <w:b w:val="0"/>
+          <w:color w:val="111827"/>
         </w:rPr>
-        <w:t>Requirement: Using the same code from Part A, create a GitHub workflow that checks out the code, builds the Docker image, and pushes it to Docker Hub.</w:t>
+        <w:t>4. Part B — GitHub Actions and Docker Hub</w:t>
       </w:r>
     </w:p>
     <w:p>
       <w:pPr>
-        <w:pStyle w:val="Heading2"/>
+        <w:spacing w:after="160"/>
       </w:pPr>
       <w:r>
-        <w:t>3.1 What we implemented</w:t>
-      </w:r>
-    </w:p>
-    <w:p>
-      <w:pPr>
-        <w:pStyle w:val="ListBullet"/>
-      </w:pPr>
-      <w:r>
-        <w:t>Workflow file: .github/workflows/deploy.yml</w:t>
-      </w:r>
-    </w:p>
-    <w:p>
-      <w:pPr>
-        <w:pStyle w:val="ListBullet"/>
-      </w:pPr>
-      <w:r>
-        <w:t>Trigger: push to main</w:t>
-      </w:r>
-    </w:p>
-    <w:p>
-      <w:pPr>
-        <w:pStyle w:val="ListBullet"/>
-      </w:pPr>
-      <w:r>
-        <w:t>Steps: checkout → Docker Hub login → build → push tags latest and &lt;git-sha&gt;</w:t>
-      </w:r>
-    </w:p>
-    <w:p>
-      <w:pPr>
-        <w:pStyle w:val="ListBullet"/>
-      </w:pPr>
-      <w:r>
-        <w:t>Same final-python codebase as Part A</w:t>
-      </w:r>
-    </w:p>
-    <w:p>
-      <w:pPr>
-        <w:pStyle w:val="Heading2"/>
-      </w:pPr>
-      <w:r>
-        <w:t>3.2 Written explanation</w:t>
-      </w:r>
-    </w:p>
-    <w:p>
-      <w:r>
         <w:rPr>
+          <w:rFonts w:ascii="Calibri" w:hAnsi="Calibri"/>
           <w:b w:val="0"/>
+          <w:color w:val="1F2937"/>
+          <w:sz w:val="22"/>
         </w:rPr>
-        <w:t>Part B uses the same application dockerized in Part A. On every push to main, GitHub Actions checks out the repository, builds the Docker image, and pushes it to Docker Hub repository john2331/final-python. Secrets are stored in GitHub Secrets and are not hardcoded.</w:t>
-      </w:r>
-    </w:p>
-    <w:p>
-      <w:pPr>
-        <w:pStyle w:val="Heading2"/>
-      </w:pPr>
-      <w:r>
-        <w:t>3.3 Screenshots — Part B</w:t>
-      </w:r>
-    </w:p>
-    <w:p>
-      <w:pPr>
-        <w:pStyle w:val="Heading3"/>
-      </w:pPr>
-      <w:r>
-        <w:t>Workflow YAML</w:t>
+        <w:t>The workflow file .github/workflows/deploy.yml checks out the repository, builds the image, and pushes tags to Docker Hub (john2331/final-python). Secrets store Docker Hub credentials and AWS access keys used for the deploy job. Images are not pushed to Amazon ECR.</w:t>
       </w:r>
     </w:p>
     <w:p>
       <w:r>
         <w:drawing>
           <wp:inline xmlns:a="http://schemas.openxmlformats.org/drawingml/2006/main" xmlns:pic="http://schemas.openxmlformats.org/drawingml/2006/picture">
-            <wp:extent cx="5486400" cy="4191000"/>
+            <wp:extent cx="5760720" cy="4400550"/>
             <wp:docPr id="4" name="Picture 4"/>
             <wp:cNvGraphicFramePr>
               <a:graphicFrameLocks noChangeAspect="1"/>
@@ -617,7 +465,7 @@
                   <pic:spPr>
                     <a:xfrm>
                       <a:off x="0" y="0"/>
-                      <a:ext cx="5486400" cy="4191000"/>
+                      <a:ext cx="5760720" cy="4400550"/>
                     </a:xfrm>
                     <a:prstGeom prst="rect"/>
                   </pic:spPr>
@@ -630,29 +478,25 @@
     </w:p>
     <w:p>
       <w:pPr>
+        <w:spacing w:after="280"/>
         <w:jc w:val="center"/>
       </w:pPr>
       <w:r>
         <w:rPr>
+          <w:rFonts w:ascii="Calibri" w:hAnsi="Calibri"/>
+          <w:b w:val="0"/>
           <w:i/>
-          <w:sz w:val="20"/>
+          <w:color w:val="1F2937"/>
+          <w:sz w:val="18"/>
         </w:rPr>
-        <w:t>Figure B1. Workflow YAML (04-workflow-yaml.png)</w:t>
-      </w:r>
-    </w:p>
-    <w:p>
-      <w:pPr>
-        <w:pStyle w:val="Heading3"/>
-      </w:pPr>
-      <w:r>
-        <w:t>Workflow success</w:t>
+        <w:t>Figure 4. GitHub Actions workflow (ECS on EC2)</w:t>
       </w:r>
     </w:p>
     <w:p>
       <w:r>
         <w:drawing>
           <wp:inline xmlns:a="http://schemas.openxmlformats.org/drawingml/2006/main" xmlns:pic="http://schemas.openxmlformats.org/drawingml/2006/picture">
-            <wp:extent cx="5486400" cy="3429000"/>
+            <wp:extent cx="5760720" cy="3600450"/>
             <wp:docPr id="5" name="Picture 5"/>
             <wp:cNvGraphicFramePr>
               <a:graphicFrameLocks noChangeAspect="1"/>
@@ -673,7 +517,7 @@
                   <pic:spPr>
                     <a:xfrm>
                       <a:off x="0" y="0"/>
-                      <a:ext cx="5486400" cy="3429000"/>
+                      <a:ext cx="5760720" cy="3600450"/>
                     </a:xfrm>
                     <a:prstGeom prst="rect"/>
                   </pic:spPr>
@@ -686,29 +530,25 @@
     </w:p>
     <w:p>
       <w:pPr>
+        <w:spacing w:after="280"/>
         <w:jc w:val="center"/>
       </w:pPr>
       <w:r>
         <w:rPr>
+          <w:rFonts w:ascii="Calibri" w:hAnsi="Calibri"/>
+          <w:b w:val="0"/>
           <w:i/>
-          <w:sz w:val="20"/>
+          <w:color w:val="1F2937"/>
+          <w:sz w:val="18"/>
         </w:rPr>
-        <w:t>Figure B2. Successful workflow run (05-workflow-success.png)</w:t>
-      </w:r>
-    </w:p>
-    <w:p>
-      <w:pPr>
-        <w:pStyle w:val="Heading3"/>
-      </w:pPr>
-      <w:r>
-        <w:t>Docker Hub repository</w:t>
+        <w:t>Figure 5. Successful workflow run</w:t>
       </w:r>
     </w:p>
     <w:p>
       <w:r>
         <w:drawing>
           <wp:inline xmlns:a="http://schemas.openxmlformats.org/drawingml/2006/main" xmlns:pic="http://schemas.openxmlformats.org/drawingml/2006/picture">
-            <wp:extent cx="5486400" cy="3429000"/>
+            <wp:extent cx="5760720" cy="3600450"/>
             <wp:docPr id="6" name="Picture 6"/>
             <wp:cNvGraphicFramePr>
               <a:graphicFrameLocks noChangeAspect="1"/>
@@ -729,7 +569,7 @@
                   <pic:spPr>
                     <a:xfrm>
                       <a:off x="0" y="0"/>
-                      <a:ext cx="5486400" cy="3429000"/>
+                      <a:ext cx="5760720" cy="3600450"/>
                     </a:xfrm>
                     <a:prstGeom prst="rect"/>
                   </pic:spPr>
@@ -742,19 +582,18 @@
     </w:p>
     <w:p>
       <w:pPr>
+        <w:spacing w:after="280"/>
         <w:jc w:val="center"/>
       </w:pPr>
       <w:r>
         <w:rPr>
+          <w:rFonts w:ascii="Calibri" w:hAnsi="Calibri"/>
+          <w:b w:val="0"/>
           <w:i/>
-          <w:sz w:val="20"/>
+          <w:color w:val="1F2937"/>
+          <w:sz w:val="18"/>
         </w:rPr>
-        <w:t>Figure B3. Docker Hub repository (06-dockerhub.png)</w:t>
-      </w:r>
-    </w:p>
-    <w:p>
-      <w:r>
-        <w:br w:type="page"/>
+        <w:t>Figure 6. Docker Hub repository tags</w:t>
       </w:r>
     </w:p>
     <w:p>
@@ -762,110 +601,31 @@
         <w:pStyle w:val="Heading1"/>
       </w:pPr>
       <w:r>
-        <w:t>4. Part C (25 points) — Amazon ECS on EC2</w:t>
-      </w:r>
-    </w:p>
-    <w:p>
-      <w:r>
         <w:rPr>
-          <w:b w:val="0"/>
+          <w:color w:val="111827"/>
         </w:rPr>
-        <w:t>Requirement: Deploy ECS and one EC2 instance on AWS. Deploy the image from Docker Hub on ECS. Provide screenshots of the ECS cluster, task definition, ECS service, and the application in the browser.</w:t>
+        <w:t>5. Part C — Amazon ECS on EC2</w:t>
       </w:r>
     </w:p>
     <w:p>
       <w:pPr>
-        <w:pStyle w:val="Heading2"/>
+        <w:spacing w:after="160"/>
       </w:pPr>
       <w:r>
-        <w:t>4.1 What we implemented</w:t>
-      </w:r>
-    </w:p>
-    <w:p>
-      <w:pPr>
-        <w:pStyle w:val="ListBullet"/>
-      </w:pPr>
-      <w:r>
-        <w:t>ECS cluster: final-python-cluster</w:t>
-      </w:r>
-    </w:p>
-    <w:p>
-      <w:pPr>
-        <w:pStyle w:val="ListBullet"/>
-      </w:pPr>
-      <w:r>
-        <w:t>One ECS-optimized EC2 instance: final-python-ecs-ec2</w:t>
-      </w:r>
-    </w:p>
-    <w:p>
-      <w:pPr>
-        <w:pStyle w:val="ListBullet"/>
-      </w:pPr>
-      <w:r>
-        <w:t>Task definition with requiresCompatibilities = EC2</w:t>
-      </w:r>
-    </w:p>
-    <w:p>
-      <w:pPr>
-        <w:pStyle w:val="ListBullet"/>
-      </w:pPr>
-      <w:r>
-        <w:t>ECS service final-python-service with launch type EC2</w:t>
-      </w:r>
-    </w:p>
-    <w:p>
-      <w:pPr>
-        <w:pStyle w:val="ListBullet"/>
-      </w:pPr>
-      <w:r>
-        <w:t>Image from Docker Hub: john2331/final-python</w:t>
-      </w:r>
-    </w:p>
-    <w:p>
-      <w:pPr>
-        <w:pStyle w:val="ListBullet"/>
-      </w:pPr>
-      <w:r>
-        <w:t>Application Load Balancer for public access</w:t>
-      </w:r>
-    </w:p>
-    <w:p>
-      <w:pPr>
-        <w:pStyle w:val="Heading2"/>
-      </w:pPr>
-      <w:r>
-        <w:t>4.2 Written explanation</w:t>
-      </w:r>
-    </w:p>
-    <w:p>
-      <w:r>
         <w:rPr>
+          <w:rFonts w:ascii="Calibri" w:hAnsi="Calibri"/>
           <w:b w:val="0"/>
+          <w:color w:val="1F2937"/>
+          <w:sz w:val="22"/>
         </w:rPr>
-        <w:t>For Part C we selected ECS (not CodeDeploy). The Docker Hub image from Part B runs on Amazon ECS with the EC2 launch type. One EC2 instance is registered to the cluster. The live application is reachable through the Application Load Balancer.</w:t>
-      </w:r>
-    </w:p>
-    <w:p>
-      <w:pPr>
-        <w:pStyle w:val="Heading2"/>
-      </w:pPr>
-      <w:r>
-        <w:t>4.3 Screenshots — Part C</w:t>
-      </w:r>
-    </w:p>
-    <w:p>
-      <w:pPr>
-        <w:pStyle w:val="Heading3"/>
-      </w:pPr>
-      <w:r>
-        <w:t>ECS Cluster</w:t>
+        <w:t>Part C deploys the Docker Hub image to Amazon ECS with launch type EC2. One EC2 instance (final-python-ecs-ec2) is registered as a container instance in final-python-cluster. The task definition requires EC2 compatibility, uses network mode awsvpc, and maps container port 5000. The ECS service final-python-service keeps one task running and registers it with target group final-python-tg behind load balancer final-python-alb.</w:t>
       </w:r>
     </w:p>
     <w:p>
       <w:r>
         <w:drawing>
           <wp:inline xmlns:a="http://schemas.openxmlformats.org/drawingml/2006/main" xmlns:pic="http://schemas.openxmlformats.org/drawingml/2006/picture">
-            <wp:extent cx="5486400" cy="1852631"/>
+            <wp:extent cx="5760720" cy="1945263"/>
             <wp:docPr id="7" name="Picture 7"/>
             <wp:cNvGraphicFramePr>
               <a:graphicFrameLocks noChangeAspect="1"/>
@@ -886,7 +646,7 @@
                   <pic:spPr>
                     <a:xfrm>
                       <a:off x="0" y="0"/>
-                      <a:ext cx="5486400" cy="1852631"/>
+                      <a:ext cx="5760720" cy="1945263"/>
                     </a:xfrm>
                     <a:prstGeom prst="rect"/>
                   </pic:spPr>
@@ -899,29 +659,25 @@
     </w:p>
     <w:p>
       <w:pPr>
+        <w:spacing w:after="280"/>
         <w:jc w:val="center"/>
       </w:pPr>
       <w:r>
         <w:rPr>
+          <w:rFonts w:ascii="Calibri" w:hAnsi="Calibri"/>
+          <w:b w:val="0"/>
           <w:i/>
-          <w:sz w:val="20"/>
+          <w:color w:val="1F2937"/>
+          <w:sz w:val="18"/>
         </w:rPr>
-        <w:t>Figure C1. ECS Cluster (07-ecs-cluster.png)</w:t>
-      </w:r>
-    </w:p>
-    <w:p>
-      <w:pPr>
-        <w:pStyle w:val="Heading3"/>
-      </w:pPr>
-      <w:r>
-        <w:t>Task Definition</w:t>
+        <w:t>Figure 7. ECS cluster with EC2 launch type service</w:t>
       </w:r>
     </w:p>
     <w:p>
       <w:r>
         <w:drawing>
           <wp:inline xmlns:a="http://schemas.openxmlformats.org/drawingml/2006/main" xmlns:pic="http://schemas.openxmlformats.org/drawingml/2006/picture">
-            <wp:extent cx="5486400" cy="991892"/>
+            <wp:extent cx="5760720" cy="1953947"/>
             <wp:docPr id="8" name="Picture 8"/>
             <wp:cNvGraphicFramePr>
               <a:graphicFrameLocks noChangeAspect="1"/>
@@ -942,7 +698,7 @@
                   <pic:spPr>
                     <a:xfrm>
                       <a:off x="0" y="0"/>
-                      <a:ext cx="5486400" cy="991892"/>
+                      <a:ext cx="5760720" cy="1953947"/>
                     </a:xfrm>
                     <a:prstGeom prst="rect"/>
                   </pic:spPr>
@@ -955,29 +711,25 @@
     </w:p>
     <w:p>
       <w:pPr>
+        <w:spacing w:after="280"/>
         <w:jc w:val="center"/>
       </w:pPr>
       <w:r>
         <w:rPr>
+          <w:rFonts w:ascii="Calibri" w:hAnsi="Calibri"/>
+          <w:b w:val="0"/>
           <w:i/>
-          <w:sz w:val="20"/>
+          <w:color w:val="1F2937"/>
+          <w:sz w:val="18"/>
         </w:rPr>
-        <w:t>Figure C2. Task Definition (08-task-definition.png)</w:t>
-      </w:r>
-    </w:p>
-    <w:p>
-      <w:pPr>
-        <w:pStyle w:val="Heading3"/>
-      </w:pPr>
-      <w:r>
-        <w:t>ECS Service</w:t>
+        <w:t>Figure 8. ECS task definition final-python (App environment: EC2)</w:t>
       </w:r>
     </w:p>
     <w:p>
       <w:r>
         <w:drawing>
           <wp:inline xmlns:a="http://schemas.openxmlformats.org/drawingml/2006/main" xmlns:pic="http://schemas.openxmlformats.org/drawingml/2006/picture">
-            <wp:extent cx="5486400" cy="2028663"/>
+            <wp:extent cx="5760720" cy="2130096"/>
             <wp:docPr id="9" name="Picture 9"/>
             <wp:cNvGraphicFramePr>
               <a:graphicFrameLocks noChangeAspect="1"/>
@@ -998,7 +750,7 @@
                   <pic:spPr>
                     <a:xfrm>
                       <a:off x="0" y="0"/>
-                      <a:ext cx="5486400" cy="2028663"/>
+                      <a:ext cx="5760720" cy="2130096"/>
                     </a:xfrm>
                     <a:prstGeom prst="rect"/>
                   </pic:spPr>
@@ -1011,29 +763,25 @@
     </w:p>
     <w:p>
       <w:pPr>
+        <w:spacing w:after="280"/>
         <w:jc w:val="center"/>
       </w:pPr>
       <w:r>
         <w:rPr>
+          <w:rFonts w:ascii="Calibri" w:hAnsi="Calibri"/>
+          <w:b w:val="0"/>
           <w:i/>
-          <w:sz w:val="20"/>
+          <w:color w:val="1F2937"/>
+          <w:sz w:val="18"/>
         </w:rPr>
-        <w:t>Figure C3. ECS Service (09-ecs-service.png)</w:t>
-      </w:r>
-    </w:p>
-    <w:p>
-      <w:pPr>
-        <w:pStyle w:val="Heading3"/>
-      </w:pPr>
-      <w:r>
-        <w:t>Live application</w:t>
+        <w:t>Figure 9. ECS service health — port 5000, ALB target healthy</w:t>
       </w:r>
     </w:p>
     <w:p>
       <w:r>
         <w:drawing>
           <wp:inline xmlns:a="http://schemas.openxmlformats.org/drawingml/2006/main" xmlns:pic="http://schemas.openxmlformats.org/drawingml/2006/picture">
-            <wp:extent cx="5486400" cy="3429000"/>
+            <wp:extent cx="5760720" cy="3600450"/>
             <wp:docPr id="10" name="Picture 10"/>
             <wp:cNvGraphicFramePr>
               <a:graphicFrameLocks noChangeAspect="1"/>
@@ -1054,7 +802,7 @@
                   <pic:spPr>
                     <a:xfrm>
                       <a:off x="0" y="0"/>
-                      <a:ext cx="5486400" cy="3429000"/>
+                      <a:ext cx="5760720" cy="3600450"/>
                     </a:xfrm>
                     <a:prstGeom prst="rect"/>
                   </pic:spPr>
@@ -1067,19 +815,18 @@
     </w:p>
     <w:p>
       <w:pPr>
+        <w:spacing w:after="280"/>
         <w:jc w:val="center"/>
       </w:pPr>
       <w:r>
         <w:rPr>
+          <w:rFonts w:ascii="Calibri" w:hAnsi="Calibri"/>
+          <w:b w:val="0"/>
           <w:i/>
-          <w:sz w:val="20"/>
+          <w:color w:val="1F2937"/>
+          <w:sz w:val="18"/>
         </w:rPr>
-        <w:t>Figure C4. Live application (10-live-app.png)</w:t>
-      </w:r>
-    </w:p>
-    <w:p>
-      <w:r>
-        <w:br w:type="page"/>
+        <w:t>Figure 10. Live application via Application Load Balancer</w:t>
       </w:r>
     </w:p>
     <w:p>
@@ -1087,15 +834,10 @@
         <w:pStyle w:val="Heading1"/>
       </w:pPr>
       <w:r>
-        <w:t>5. Operations reference</w:t>
-      </w:r>
-    </w:p>
-    <w:p>
-      <w:pPr>
-        <w:pStyle w:val="Heading2"/>
-      </w:pPr>
-      <w:r>
-        <w:t>5.1 GitHub Secrets</w:t>
+        <w:rPr>
+          <w:color w:val="111827"/>
+        </w:rPr>
+        <w:t>6. Verification checklist</w:t>
       </w:r>
     </w:p>
     <w:p>
@@ -1103,7 +845,13 @@
         <w:pStyle w:val="ListBullet"/>
       </w:pPr>
       <w:r>
-        <w:t>DOCKERHUB_USERNAME</w:t>
+        <w:rPr>
+          <w:rFonts w:ascii="Calibri" w:hAnsi="Calibri"/>
+          <w:b w:val="0"/>
+          <w:color w:val="1F2937"/>
+          <w:sz w:val="22"/>
+        </w:rPr>
+        <w:t>Dockerfile builds and runs locally on port 5000</w:t>
       </w:r>
     </w:p>
     <w:p>
@@ -1111,7 +859,13 @@
         <w:pStyle w:val="ListBullet"/>
       </w:pPr>
       <w:r>
-        <w:t>DOCKERHUB_TOKEN</w:t>
+        <w:rPr>
+          <w:rFonts w:ascii="Calibri" w:hAnsi="Calibri"/>
+          <w:b w:val="0"/>
+          <w:color w:val="1F2937"/>
+          <w:sz w:val="22"/>
+        </w:rPr>
+        <w:t>GitHub Actions builds and pushes to Docker Hub</w:t>
       </w:r>
     </w:p>
     <w:p>
@@ -1119,7 +873,13 @@
         <w:pStyle w:val="ListBullet"/>
       </w:pPr>
       <w:r>
-        <w:t>DOCKERHUB_REPOSITORY</w:t>
+        <w:rPr>
+          <w:rFonts w:ascii="Calibri" w:hAnsi="Calibri"/>
+          <w:b w:val="0"/>
+          <w:color w:val="1F2937"/>
+          <w:sz w:val="22"/>
+        </w:rPr>
+        <w:t>ECS service launch type is EC2</w:t>
       </w:r>
     </w:p>
     <w:p>
@@ -1127,7 +887,13 @@
         <w:pStyle w:val="ListBullet"/>
       </w:pPr>
       <w:r>
-        <w:t>AWS_REGION</w:t>
+        <w:rPr>
+          <w:rFonts w:ascii="Calibri" w:hAnsi="Calibri"/>
+          <w:b w:val="0"/>
+          <w:color w:val="1F2937"/>
+          <w:sz w:val="22"/>
+        </w:rPr>
+        <w:t>Task definition requiresCompatibilities includes EC2</w:t>
       </w:r>
     </w:p>
     <w:p>
@@ -1135,7 +901,13 @@
         <w:pStyle w:val="ListBullet"/>
       </w:pPr>
       <w:r>
-        <w:t>AWS_ACCESS_KEY_ID</w:t>
+        <w:rPr>
+          <w:rFonts w:ascii="Calibri" w:hAnsi="Calibri"/>
+          <w:b w:val="0"/>
+          <w:color w:val="1F2937"/>
+          <w:sz w:val="22"/>
+        </w:rPr>
+        <w:t>Container image comes from john2331/final-python</w:t>
       </w:r>
     </w:p>
     <w:p>
@@ -1143,7 +915,13 @@
         <w:pStyle w:val="ListBullet"/>
       </w:pPr>
       <w:r>
-        <w:t>AWS_SECRET_ACCESS_KEY</w:t>
+        <w:rPr>
+          <w:rFonts w:ascii="Calibri" w:hAnsi="Calibri"/>
+          <w:b w:val="0"/>
+          <w:color w:val="1F2937"/>
+          <w:sz w:val="22"/>
+        </w:rPr>
+        <w:t>ALB /health and /api/doc respond successfully</w:t>
       </w:r>
     </w:p>
     <w:p>
@@ -1151,119 +929,13 @@
         <w:pStyle w:val="ListBullet"/>
       </w:pPr>
       <w:r>
-        <w:t>ECS_CLUSTER</w:t>
-      </w:r>
-    </w:p>
-    <w:p>
-      <w:pPr>
-        <w:pStyle w:val="ListBullet"/>
-      </w:pPr>
-      <w:r>
-        <w:t>ECS_SERVICE</w:t>
-      </w:r>
-    </w:p>
-    <w:p>
-      <w:pPr>
-        <w:pStyle w:val="ListBullet"/>
-      </w:pPr>
-      <w:r>
-        <w:t>ECS_TASK_DEFINITION</w:t>
-      </w:r>
-    </w:p>
-    <w:p>
-      <w:pPr>
-        <w:pStyle w:val="ListBullet"/>
-      </w:pPr>
-      <w:r>
-        <w:t>CONTAINER_NAME</w:t>
-      </w:r>
-    </w:p>
-    <w:p>
-      <w:pPr>
-        <w:pStyle w:val="Heading2"/>
-      </w:pPr>
-      <w:r>
-        <w:t>5.2 Screenshot index</w:t>
-      </w:r>
-    </w:p>
-    <w:p>
-      <w:pPr>
-        <w:pStyle w:val="ListBullet"/>
-      </w:pPr>
-      <w:r>
-        <w:t>01-github-repo.png — GitHub repository</w:t>
-      </w:r>
-    </w:p>
-    <w:p>
-      <w:pPr>
-        <w:pStyle w:val="ListBullet"/>
-      </w:pPr>
-      <w:r>
-        <w:t>02-dockerfile.png — Dockerfile</w:t>
-      </w:r>
-    </w:p>
-    <w:p>
-      <w:pPr>
-        <w:pStyle w:val="ListBullet"/>
-      </w:pPr>
-      <w:r>
-        <w:t>03-local-app.png — Local app in browser</w:t>
-      </w:r>
-    </w:p>
-    <w:p>
-      <w:pPr>
-        <w:pStyle w:val="ListBullet"/>
-      </w:pPr>
-      <w:r>
-        <w:t>04-workflow-yaml.png — Workflow YAML</w:t>
-      </w:r>
-    </w:p>
-    <w:p>
-      <w:pPr>
-        <w:pStyle w:val="ListBullet"/>
-      </w:pPr>
-      <w:r>
-        <w:t>05-workflow-success.png — Successful Actions run</w:t>
-      </w:r>
-    </w:p>
-    <w:p>
-      <w:pPr>
-        <w:pStyle w:val="ListBullet"/>
-      </w:pPr>
-      <w:r>
-        <w:t>06-dockerhub.png — Docker Hub repository</w:t>
-      </w:r>
-    </w:p>
-    <w:p>
-      <w:pPr>
-        <w:pStyle w:val="ListBullet"/>
-      </w:pPr>
-      <w:r>
-        <w:t>07-ecs-cluster.png — ECS Cluster</w:t>
-      </w:r>
-    </w:p>
-    <w:p>
-      <w:pPr>
-        <w:pStyle w:val="ListBullet"/>
-      </w:pPr>
-      <w:r>
-        <w:t>08-task-definition.png — Task Definition (EC2)</w:t>
-      </w:r>
-    </w:p>
-    <w:p>
-      <w:pPr>
-        <w:pStyle w:val="ListBullet"/>
-      </w:pPr>
-      <w:r>
-        <w:t>09-ecs-service.png — ECS Service (EC2)</w:t>
-      </w:r>
-    </w:p>
-    <w:p>
-      <w:pPr>
-        <w:pStyle w:val="ListBullet"/>
-      </w:pPr>
-      <w:r>
-        <w:t>10-live-app.png — Live app via ALB</w:t>
+        <w:rPr>
+          <w:rFonts w:ascii="Calibri" w:hAnsi="Calibri"/>
+          <w:b w:val="0"/>
+          <w:color w:val="1F2937"/>
+          <w:sz w:val="22"/>
+        </w:rPr>
+        <w:t>Documentation and screenshots match the EC2 deployment</w:t>
       </w:r>
     </w:p>
     <w:p>
@@ -1271,20 +943,85 @@
         <w:pStyle w:val="Heading1"/>
       </w:pPr>
       <w:r>
-        <w:t>6. Conclusion</w:t>
+        <w:rPr>
+          <w:color w:val="111827"/>
+        </w:rPr>
+        <w:t>7. How to reproduce</w:t>
       </w:r>
     </w:p>
     <w:p>
+      <w:pPr>
+        <w:spacing w:after="160"/>
+      </w:pPr>
       <w:r>
         <w:rPr>
+          <w:rFonts w:ascii="Calibri" w:hAnsi="Calibri"/>
           <w:b w:val="0"/>
+          <w:color w:val="1F2937"/>
+          <w:sz w:val="22"/>
         </w:rPr>
-        <w:t>All selected course parts are implemented: Dockerization of final-python, CI/CD to Docker Hub, and deployment to Amazon ECS with one EC2 instance. Screenshots and explanations are included above.</w:t>
+        <w:t>Clone and run locally:</w:t>
+      </w:r>
+    </w:p>
+    <w:p>
+      <w:pPr>
+        <w:spacing w:after="160"/>
+      </w:pPr>
+      <w:r>
+        <w:rPr>
+          <w:rFonts w:ascii="Calibri" w:hAnsi="Calibri"/>
+          <w:b w:val="0"/>
+          <w:color w:val="1F2937"/>
+          <w:sz w:val="22"/>
+        </w:rPr>
+        <w:t>git clone https://github.com/john-2331/final-python.git</w:t>
+      </w:r>
+    </w:p>
+    <w:p>
+      <w:pPr>
+        <w:spacing w:after="160"/>
+      </w:pPr>
+      <w:r>
+        <w:rPr>
+          <w:rFonts w:ascii="Calibri" w:hAnsi="Calibri"/>
+          <w:b w:val="0"/>
+          <w:color w:val="1F2937"/>
+          <w:sz w:val="22"/>
+        </w:rPr>
+        <w:t>docker compose up --build</w:t>
+      </w:r>
+    </w:p>
+    <w:p>
+      <w:pPr>
+        <w:spacing w:after="160"/>
+      </w:pPr>
+      <w:r>
+        <w:rPr>
+          <w:rFonts w:ascii="Calibri" w:hAnsi="Calibri"/>
+          <w:b w:val="0"/>
+          <w:color w:val="1F2937"/>
+          <w:sz w:val="22"/>
+        </w:rPr>
+        <w:t>Open http://localhost:5000/api/doc</w:t>
+      </w:r>
+    </w:p>
+    <w:p>
+      <w:pPr>
+        <w:spacing w:after="160"/>
+      </w:pPr>
+      <w:r>
+        <w:rPr>
+          <w:rFonts w:ascii="Calibri" w:hAnsi="Calibri"/>
+          <w:b w:val="0"/>
+          <w:color w:val="1F2937"/>
+          <w:sz w:val="22"/>
+        </w:rPr>
+        <w:t>CI/CD deploys automatically on push to main after repository secrets are configured (DOCKERHUB_USERNAME, DOCKERHUB_TOKEN, DOCKERHUB_REPOSITORY, AWS_ACCESS_KEY_ID, AWS_SECRET_ACCESS_KEY, AWS_REGION, ECS_CLUSTER, ECS_SERVICE, ECS_TASK_DEFINITION).</w:t>
       </w:r>
     </w:p>
     <w:sectPr>
       <w:pgSz w:w="12240" w:h="15840"/>
-      <w:pgMar w:top="1440" w:right="1800" w:bottom="1440" w:left="1800" w:header="720" w:footer="720" w:gutter="0"/>
+      <w:pgMar w:top="1152" w:right="1296" w:bottom="1152" w:left="1296" w:header="720" w:footer="720" w:gutter="0"/>
       <w:cols w:space="720"/>
       <w:docGrid w:linePitch="360"/>
     </w:sectPr>
@@ -1655,10 +1392,6 @@
     <w:name w:val="Normal"/>
     <w:qFormat/>
     <w:rsid w:val="00FC693F"/>
-    <w:rPr>
-      <w:rFonts w:ascii="Calibri" w:hAnsi="Calibri"/>
-      <w:sz w:val="22"/>
-    </w:rPr>
   </w:style>
   <w:style w:type="paragraph" w:styleId="Header">
     <w:name w:val="header"/>

</xml_diff>